<commit_message>
Update resume download asset
</commit_message>
<xml_diff>
--- a/public/resume.docx
+++ b/public/resume.docx
@@ -873,15 +873,7 @@
         <w:spacing w:after="0"/>
       </w:pPr>
       <w:r>
-        <w:t>RAG Incident Assistant (</w:t>
-      </w:r>
-      <w:proofErr w:type="spellStart"/>
-      <w:r>
-        <w:t>FastAPI</w:t>
-      </w:r>
-      <w:proofErr w:type="spellEnd"/>
-      <w:r>
-        <w:t xml:space="preserve">) — GenAI/RAG | GitHub: </w:t>
+        <w:t xml:space="preserve">RAG Incident Assistant  — GenAI/RAG | GitHub: </w:t>
       </w:r>
       <w:hyperlink r:id="rId7" w:history="1">
         <w:r>

</xml_diff>

<commit_message>
Remove MLOps references and expand contact details
</commit_message>
<xml_diff>
--- a/public/resume.docx
+++ b/public/resume.docx
@@ -60,46 +60,35 @@
           <w:b/>
           <w:sz w:val="24"/>
         </w:rPr>
-        <w:t xml:space="preserve">Senior Platform Reliability Engineer | </w:t>
+        <w:t>Senior Platform Reliability Engineer | DevOps | AIOps | GenAI - Professional Summary</w:t>
       </w:r>
       <w:r>
         <w:rPr>
           <w:b/>
           <w:sz w:val="24"/>
         </w:rPr>
-        <w:t>DevOps</w:t>
       </w:r>
       <w:r>
         <w:rPr>
           <w:b/>
           <w:sz w:val="24"/>
         </w:rPr>
-        <w:t xml:space="preserve"> | </w:t>
       </w:r>
       <w:r>
         <w:rPr>
           <w:b/>
           <w:sz w:val="24"/>
         </w:rPr>
-        <w:t>AIOps | GenAI  &amp; MLOps — Professional Summary</w:t>
       </w:r>
     </w:p>
     <w:p>
       <w:r>
-        <w:t xml:space="preserve">Senior Platform Reliability Engineer with 11+ years of enterprise IT experience specializing in production reliability, observability engineering, incident triage, and infrastructure automation. Strong expertise in building actionable dashboards and alerts using Sumo Logic, Splunk, Grafana/Prometheus, Dynatrace, and </w:t>
+        <w:t>Senior Platform Reliability Engineer with 11+ years of enterprise IT experience specializing in production reliability, observability engineering, incident triage, and infrastructure automation. Strong expertise in building actionable dashboards and alerts using Sumo Logic, Splunk, Grafana/Prometheus, Dynatrace, and Glass box, and monitoring AWS platforms including EKS, Lambda, Batch, EC2, and S3. Experienced in Terraform-based automation (IaC) and CI/CD enablement using Jenkins and Ansible. Hands-on exposure to AIOps-aligned operational patterns such as anomaly detection, signal correlation, alert noise reduction, and guided troubleshooting to improve operational response and reduce MTTR. Additionally, worked on GenAI (RAG-aligned workflows) and model deployment and monitoring on AWS SageMaker, enabling faster troubleshooting through log summarization, knowledge-grounded retrieval, and secure PII remediation using Amazon Comprehend.</w:t>
       </w:r>
-      <w:r>
-        <w:t>Glass box</w:t>
-      </w:r>
-      <w:r>
-        <w:t>, and monitoring AWS platforms including EKS, Lambda, Batch, EC2, and S3. Experienced in Terraform-based automation (IaC) and CI/CD enablement using Jenkins and Ansible. Hands-on exposure to AIOps-aligned operational patterns such as anomaly detection, signal correlation, alert noise reduction, and guided troubleshooting to improve operational response and reduce M</w:t>
-      </w:r>
-      <w:r>
-        <w:t>T</w:t>
-      </w:r>
-      <w:r>
-        <w:t>TR. Additionally, worked on GenAI (RAG-aligned workflows) and MLOps practices including model deployment and monitoring on AWS SageMaker, enabling faster troubleshooting through log summarization, knowledge-grounded retrieval, and secure PII remediation using Amazon Comprehend.</w:t>
-      </w:r>
+      <w:r/>
+      <w:r/>
+      <w:r/>
+      <w:r/>
     </w:p>
     <w:p>
       <w:r>
@@ -226,7 +215,7 @@
         <w:spacing w:after="0"/>
       </w:pPr>
       <w:r>
-        <w:t>MLOps (Exposure): Model deployment and monitoring workflows (AWS SageMaker)</w:t>
+        <w:t>Model Deployment (Exposure): AWS SageMaker deployment and monitoring workflows</w:t>
       </w:r>
     </w:p>
     <w:p>
@@ -339,7 +328,7 @@
         <w:spacing w:after="0"/>
       </w:pPr>
       <w:r>
-        <w:t>GenAI / RAG / MLOps: AWS SageMaker deployments, RAG concepts, log summarization, error grouping</w:t>
+        <w:t>GenAI / RAG: AWS SageMaker deployments, RAG concepts, log summarization, error grouping</w:t>
       </w:r>
     </w:p>
     <w:p>
@@ -402,19 +391,17 @@
         <w:rPr>
           <w:b/>
         </w:rPr>
-        <w:t xml:space="preserve">Ameriprise Financial — Senior Platform Reliability Engineer | </w:t>
+        <w:t>Ameriprise Financial — Senior Platform Reliability Engineer | DevOps | AIOps | GenAI (RAG) Exposure</w:t>
       </w:r>
       <w:r>
         <w:rPr>
           <w:b/>
         </w:rPr>
-        <w:t>DevOps |</w:t>
       </w:r>
       <w:r>
         <w:rPr>
           <w:b/>
         </w:rPr>
-        <w:t xml:space="preserve"> AIOps | GenAI (RAG) &amp; MLOps Exposure</w:t>
       </w:r>
     </w:p>
     <w:p>

</xml_diff>